<commit_message>
Give portfolio project questions all four answer parts and rebuild Google Docs files
Co-Authored-By: Claude Opus 5.5 <noreply@anthropic.com>
Claude-Session: https://claude.ai/code/session_015XUNUKPXGTZTYLE5hP9Ue5
</commit_message>
<xml_diff>
--- a/google-docs/18-behavioral-leadership.docx
+++ b/google-docs/18-behavioral-leadership.docx
@@ -1922,6 +1922,52 @@
       </w:r>
     </w:p>
     <w:p>
+      <w:r>
+        <w:rPr/>
+        <w:t xml:space="preserve">For behavioural questions, the four parts work like this: </w:t>
+      </w:r>
+      <w:r>
+        <w:rPr>
+          <w:b/>
+        </w:rPr>
+        <w:t>Short answer</w:t>
+      </w:r>
+      <w:r>
+        <w:rPr/>
+        <w:t xml:space="preserve"> is the key message you want the interviewer to remember, </w:t>
+      </w:r>
+      <w:r>
+        <w:rPr>
+          <w:b/>
+        </w:rPr>
+        <w:t>Explanation</w:t>
+      </w:r>
+      <w:r>
+        <w:rPr/>
+        <w:t xml:space="preserve"> is what they're testing and how to structure your answer, </w:t>
+      </w:r>
+      <w:r>
+        <w:rPr>
+          <w:b/>
+        </w:rPr>
+        <w:t>Example</w:t>
+      </w:r>
+      <w:r>
+        <w:rPr/>
+        <w:t xml:space="preserve"> is the story or detail to use, and </w:t>
+      </w:r>
+      <w:r>
+        <w:rPr>
+          <w:b/>
+        </w:rPr>
+        <w:t>Say it like this</w:t>
+      </w:r>
+      <w:r>
+        <w:rPr/>
+        <w:t xml:space="preserve"> is a full sample answer.</w:t>
+      </w:r>
+    </w:p>
+    <w:p>
       <w:pPr>
         <w:pStyle w:val="Heading2"/>
         <w:pBdr>
@@ -1967,11 +2013,11 @@
         <w:rPr>
           <w:b/>
         </w:rPr>
-        <w:t>Structure:</w:t>
-      </w:r>
-      <w:r>
-        <w:rPr/>
-        <w:t xml:space="preserve"> present → highlights → why this role.</w:t>
+        <w:t>Short answer:</w:t>
+      </w:r>
+      <w:r>
+        <w:rPr/>
+        <w:t xml:space="preserve"> A senior React and TypeScript engineer who owns frontend architecture for two products, with measurable wins in real-time video, multi-tenant dashboards, security and team quality.</w:t>
       </w:r>
     </w:p>
     <w:p>
@@ -1982,7 +2028,37 @@
         <w:rPr>
           <w:b/>
         </w:rPr>
-        <w:t>Sample answer:</w:t>
+        <w:t>Explanation:</w:t>
+      </w:r>
+      <w:r>
+        <w:rPr/>
+        <w:t xml:space="preserve"> They're testing whether you can summarise yourself clearly and whether you fit the role. Structure: present → two or three highlights with numbers → why this role. Don't recite your CV from college onwards.</w:t>
+      </w:r>
+    </w:p>
+    <w:p>
+      <w:r>
+        <w:rPr/>
+      </w:r>
+      <w:r>
+        <w:rPr>
+          <w:b/>
+        </w:rPr>
+        <w:t>Example:</w:t>
+      </w:r>
+      <w:r>
+        <w:rPr/>
+        <w:t xml:space="preserve"> Highlights to choose from: LiveKit join under 5 s and 99% reconnect success; BpoBox serving 5 tenants and 1,500 users with QA review time down 60%; the security audit (8 critical issues); testing standards for 15 developers (bugs down 30%).</w:t>
+      </w:r>
+    </w:p>
+    <w:p>
+      <w:r>
+        <w:rPr/>
+      </w:r>
+      <w:r>
+        <w:rPr>
+          <w:b/>
+        </w:rPr>
+        <w:t>Say it like this:</w:t>
       </w:r>
       <w:r>
         <w:rPr/>
@@ -2030,11 +2106,11 @@
         <w:rPr>
           <w:b/>
         </w:rPr>
-        <w:t>Approach:</w:t>
-      </w:r>
-      <w:r>
-        <w:rPr/>
-        <w:t xml:space="preserve"> Keep it positive and forward-looking: scale, scope, domain, learning. Never criticise your employer.</w:t>
+        <w:t>Short answer:</w:t>
+      </w:r>
+      <w:r>
+        <w:rPr/>
+        <w:t xml:space="preserve"> For the next step in scale and scope, not to escape something.</w:t>
       </w:r>
     </w:p>
     <w:p>
@@ -2045,7 +2121,37 @@
         <w:rPr>
           <w:b/>
         </w:rPr>
-        <w:t>Sample answer:</w:t>
+        <w:t>Explanation:</w:t>
+      </w:r>
+      <w:r>
+        <w:rPr/>
+        <w:t xml:space="preserve"> They're checking for red flags such as conflict or job-hopping. Keep it positive and forward-looking: scale, scope, domain, learning. Never criticise your employer.</w:t>
+      </w:r>
+    </w:p>
+    <w:p>
+      <w:r>
+        <w:rPr/>
+      </w:r>
+      <w:r>
+        <w:rPr>
+          <w:b/>
+        </w:rPr>
+        <w:t>Example:</w:t>
+      </w:r>
+      <w:r>
+        <w:rPr/>
+        <w:t xml:space="preserve"> Growth at Arcitech from Software Engineer to Senior, owning architecture for two products, and now wanting larger scale and deeper platform work.</w:t>
+      </w:r>
+    </w:p>
+    <w:p>
+      <w:r>
+        <w:rPr/>
+      </w:r>
+      <w:r>
+        <w:rPr>
+          <w:b/>
+        </w:rPr>
+        <w:t>Say it like this:</w:t>
       </w:r>
       <w:r>
         <w:rPr/>
@@ -2093,11 +2199,11 @@
         <w:rPr>
           <w:b/>
         </w:rPr>
-        <w:t>Approach:</w:t>
-      </w:r>
-      <w:r>
-        <w:rPr/>
-        <w:t xml:space="preserve"> Show research (the product, the technical challenges, the engineering blog, the values) and connect it to your experience.</w:t>
+        <w:t>Short answer:</w:t>
+      </w:r>
+      <w:r>
+        <w:rPr/>
+        <w:t xml:space="preserve"> Show specific research and connect their challenges to your experience.</w:t>
       </w:r>
     </w:p>
     <w:p>
@@ -2108,7 +2214,37 @@
         <w:rPr>
           <w:b/>
         </w:rPr>
-        <w:t>Sample answer:</w:t>
+        <w:t>Explanation:</w:t>
+      </w:r>
+      <w:r>
+        <w:rPr/>
+        <w:t xml:space="preserve"> Generic praise ("great culture") is a weak answer. Mention the product, a technical challenge, an engineering blog post or a value, and link it to work you've done.</w:t>
+      </w:r>
+    </w:p>
+    <w:p>
+      <w:r>
+        <w:rPr/>
+      </w:r>
+      <w:r>
+        <w:rPr>
+          <w:b/>
+        </w:rPr>
+        <w:t>Example:</w:t>
+      </w:r>
+      <w:r>
+        <w:rPr/>
+        <w:t xml:space="preserve"> "Your post on real-time collaboration" → your LiveKit work; "multi-tenant enterprise customers" → BpoBox.</w:t>
+      </w:r>
+    </w:p>
+    <w:p>
+      <w:r>
+        <w:rPr/>
+      </w:r>
+      <w:r>
+        <w:rPr>
+          <w:b/>
+        </w:rPr>
+        <w:t>Say it like this:</w:t>
       </w:r>
       <w:r>
         <w:rPr/>
@@ -2156,7 +2292,52 @@
         <w:rPr>
           <w:b/>
         </w:rPr>
-        <w:t>Sample answer:</w:t>
+        <w:t>Short answer:</w:t>
+      </w:r>
+      <w:r>
+        <w:rPr/>
+        <w:t xml:space="preserve"> Two strengths, each backed by a result: ownership of reliability, and making teams faster and better.</w:t>
+      </w:r>
+    </w:p>
+    <w:p>
+      <w:r>
+        <w:rPr/>
+      </w:r>
+      <w:r>
+        <w:rPr>
+          <w:b/>
+        </w:rPr>
+        <w:t>Explanation:</w:t>
+      </w:r>
+      <w:r>
+        <w:rPr/>
+        <w:t xml:space="preserve"> Claims without proof are forgettable. Pick strengths that match the job description and prove each with one story.</w:t>
+      </w:r>
+    </w:p>
+    <w:p>
+      <w:r>
+        <w:rPr/>
+      </w:r>
+      <w:r>
+        <w:rPr>
+          <w:b/>
+        </w:rPr>
+        <w:t>Example:</w:t>
+      </w:r>
+      <w:r>
+        <w:rPr/>
+        <w:t xml:space="preserve"> The unassigned security audit (S1), and the testing standards that cut bugs by 30% (S4).</w:t>
+      </w:r>
+    </w:p>
+    <w:p>
+      <w:r>
+        <w:rPr/>
+      </w:r>
+      <w:r>
+        <w:rPr>
+          <w:b/>
+        </w:rPr>
+        <w:t>Say it like this:</w:t>
       </w:r>
       <w:r>
         <w:rPr/>
@@ -2204,11 +2385,11 @@
         <w:rPr>
           <w:b/>
         </w:rPr>
-        <w:t>Approach:</w:t>
-      </w:r>
-      <w:r>
-        <w:rPr/>
-        <w:t xml:space="preserve"> Pick something real but not fatal, and show active improvement.</w:t>
+        <w:t>Short answer:</w:t>
+      </w:r>
+      <w:r>
+        <w:rPr/>
+        <w:t xml:space="preserve"> Something real but not fatal, with evidence that you're actively improving.</w:t>
       </w:r>
     </w:p>
     <w:p>
@@ -2219,7 +2400,37 @@
         <w:rPr>
           <w:b/>
         </w:rPr>
-        <w:t>Sample answer:</w:t>
+        <w:t>Explanation:</w:t>
+      </w:r>
+      <w:r>
+        <w:rPr/>
+        <w:t xml:space="preserve"> They're testing self-awareness and honesty. Avoid fake weaknesses ("I'm a perfectionist") and anything core to the role.</w:t>
+      </w:r>
+    </w:p>
+    <w:p>
+      <w:r>
+        <w:rPr/>
+      </w:r>
+      <w:r>
+        <w:rPr>
+          <w:b/>
+        </w:rPr>
+        <w:t>Example:</w:t>
+      </w:r>
+      <w:r>
+        <w:rPr/>
+        <w:t xml:space="preserve"> Taking too much on yourself under pressure, which made you a bottleneck with 15 developers.</w:t>
+      </w:r>
+    </w:p>
+    <w:p>
+      <w:r>
+        <w:rPr/>
+      </w:r>
+      <w:r>
+        <w:rPr>
+          <w:b/>
+        </w:rPr>
+        <w:t>Say it like this:</w:t>
       </w:r>
       <w:r>
         <w:rPr/>
@@ -2267,7 +2478,52 @@
         <w:rPr>
           <w:b/>
         </w:rPr>
-        <w:t>Sample answer:</w:t>
+        <w:t>Short answer:</w:t>
+      </w:r>
+      <w:r>
+        <w:rPr/>
+        <w:t xml:space="preserve"> Growing in depth and scope towards staff-level architecture ownership while staying hands-on.</w:t>
+      </w:r>
+    </w:p>
+    <w:p>
+      <w:r>
+        <w:rPr/>
+      </w:r>
+      <w:r>
+        <w:rPr>
+          <w:b/>
+        </w:rPr>
+        <w:t>Explanation:</w:t>
+      </w:r>
+      <w:r>
+        <w:rPr/>
+        <w:t xml:space="preserve"> They want ambition that fits the role and suggests you'll stay. Don't say "in your job" or "running my own startup".</w:t>
+      </w:r>
+    </w:p>
+    <w:p>
+      <w:r>
+        <w:rPr/>
+      </w:r>
+      <w:r>
+        <w:rPr>
+          <w:b/>
+        </w:rPr>
+        <w:t>Example:</w:t>
+      </w:r>
+      <w:r>
+        <w:rPr/>
+        <w:t xml:space="preserve"> Owning a platform area, setting technical direction, and mentoring engineers.</w:t>
+      </w:r>
+    </w:p>
+    <w:p>
+      <w:r>
+        <w:rPr/>
+      </w:r>
+      <w:r>
+        <w:rPr>
+          <w:b/>
+        </w:rPr>
+        <w:t>Say it like this:</w:t>
       </w:r>
       <w:r>
         <w:rPr/>
@@ -2315,11 +2571,11 @@
         <w:rPr>
           <w:b/>
         </w:rPr>
-        <w:t>Approach:</w:t>
-      </w:r>
-      <w:r>
-        <w:rPr/>
-        <w:t xml:space="preserve"> Map three JD requirements to three proofs from your work.</w:t>
+        <w:t>Short answer:</w:t>
+      </w:r>
+      <w:r>
+        <w:rPr/>
+        <w:t xml:space="preserve"> Map three of their requirements to three proofs from your work.</w:t>
       </w:r>
     </w:p>
     <w:p>
@@ -2330,7 +2586,37 @@
         <w:rPr>
           <w:b/>
         </w:rPr>
-        <w:t>Sample answer:</w:t>
+        <w:t>Explanation:</w:t>
+      </w:r>
+      <w:r>
+        <w:rPr/>
+        <w:t xml:space="preserve"> Read the job description beforehand and pick the three things they care about most. This is a closing pitch, so keep it to about 30 seconds.</w:t>
+      </w:r>
+    </w:p>
+    <w:p>
+      <w:r>
+        <w:rPr/>
+      </w:r>
+      <w:r>
+        <w:rPr>
+          <w:b/>
+        </w:rPr>
+        <w:t>Example:</w:t>
+      </w:r>
+      <w:r>
+        <w:rPr/>
+        <w:t xml:space="preserve"> React architecture at scale → two products; real-time → LiveKit; quality and mentoring → testing standards.</w:t>
+      </w:r>
+    </w:p>
+    <w:p>
+      <w:r>
+        <w:rPr/>
+      </w:r>
+      <w:r>
+        <w:rPr>
+          <w:b/>
+        </w:rPr>
+        <w:t>Say it like this:</w:t>
       </w:r>
       <w:r>
         <w:rPr/>
@@ -2378,11 +2664,56 @@
         <w:rPr>
           <w:b/>
         </w:rPr>
-        <w:t>Sample answer:</w:t>
-      </w:r>
-      <w:r>
-        <w:rPr/>
-        <w:t xml:space="preserve"> Use S2 (LiveKit reliability) or S1 (the security audit). Explain why it mattered to patients or customers, not just the technical win.</w:t>
+        <w:t>Short answer:</w:t>
+      </w:r>
+      <w:r>
+        <w:rPr/>
+        <w:t xml:space="preserve"> One story where the impact on real people is clear, such as LiveKit reliability (S2) or the security audit (S1).</w:t>
+      </w:r>
+    </w:p>
+    <w:p>
+      <w:r>
+        <w:rPr/>
+      </w:r>
+      <w:r>
+        <w:rPr>
+          <w:b/>
+        </w:rPr>
+        <w:t>Explanation:</w:t>
+      </w:r>
+      <w:r>
+        <w:rPr/>
+        <w:t xml:space="preserve"> Explain why it mattered to patients or customers, not just the technical win. Your pride shows your values.</w:t>
+      </w:r>
+    </w:p>
+    <w:p>
+      <w:r>
+        <w:rPr/>
+      </w:r>
+      <w:r>
+        <w:rPr>
+          <w:b/>
+        </w:rPr>
+        <w:t>Example:</w:t>
+      </w:r>
+      <w:r>
+        <w:rPr/>
+        <w:t xml:space="preserve"> Calls dropping on hospital Wi-Fi delayed patient care; after your work, join took under 5 s and 99% of reconnects recovered.</w:t>
+      </w:r>
+    </w:p>
+    <w:p>
+      <w:r>
+        <w:rPr/>
+      </w:r>
+      <w:r>
+        <w:rPr>
+          <w:b/>
+        </w:rPr>
+        <w:t>Say it like this:</w:t>
+      </w:r>
+      <w:r>
+        <w:rPr/>
+        <w:t xml:space="preserve"> "I'm most proud of the InterpretIQ video reliability work. When a call drops in a hospital, a patient is waiting for an interpreter. I instrumented the join flow, rebuilt reconnection as a state machine, and we got join time under 5 seconds and 99% reconnect success. It's the work where I could most clearly see the impact on real people."</w:t>
       </w:r>
     </w:p>
     <w:p>
@@ -2426,7 +2757,52 @@
         <w:rPr>
           <w:b/>
         </w:rPr>
-        <w:t>Sample answer:</w:t>
+        <w:t>Short answer:</w:t>
+      </w:r>
+      <w:r>
+        <w:rPr/>
+        <w:t xml:space="preserve"> Frontend architecture owner for InterpretIQ and BpoBox, contributing to the backend where reliability needs it, and setting standards for the team.</w:t>
+      </w:r>
+    </w:p>
+    <w:p>
+      <w:r>
+        <w:rPr/>
+      </w:r>
+      <w:r>
+        <w:rPr>
+          <w:b/>
+        </w:rPr>
+        <w:t>Explanation:</w:t>
+      </w:r>
+      <w:r>
+        <w:rPr/>
+        <w:t xml:space="preserve"> Show scope (products, team size), collaboration (who you work with) and leadership (standards, mentoring).</w:t>
+      </w:r>
+    </w:p>
+    <w:p>
+      <w:r>
+        <w:rPr/>
+      </w:r>
+      <w:r>
+        <w:rPr>
+          <w:b/>
+        </w:rPr>
+        <w:t>Example:</w:t>
+      </w:r>
+      <w:r>
+        <w:rPr/>
+        <w:t xml:space="preserve"> FastAPI permission checks, AWS infrastructure design, working with the PM, backend and DevOps engineers.</w:t>
+      </w:r>
+    </w:p>
+    <w:p>
+      <w:r>
+        <w:rPr/>
+      </w:r>
+      <w:r>
+        <w:rPr>
+          <w:b/>
+        </w:rPr>
+        <w:t>Say it like this:</w:t>
       </w:r>
       <w:r>
         <w:rPr/>
@@ -2474,7 +2850,52 @@
         <w:rPr>
           <w:b/>
         </w:rPr>
-        <w:t>Sample answer:</w:t>
+        <w:t>Short answer:</w:t>
+      </w:r>
+      <w:r>
+        <w:rPr/>
+        <w:t xml:space="preserve"> Prioritise by impact, communicate early, and cut scope rather than quality on critical paths.</w:t>
+      </w:r>
+    </w:p>
+    <w:p>
+      <w:r>
+        <w:rPr/>
+      </w:r>
+      <w:r>
+        <w:rPr>
+          <w:b/>
+        </w:rPr>
+        <w:t>Explanation:</w:t>
+      </w:r>
+      <w:r>
+        <w:rPr/>
+        <w:t xml:space="preserve"> They want a method, not "I work well under pressure". Give one concrete example.</w:t>
+      </w:r>
+    </w:p>
+    <w:p>
+      <w:r>
+        <w:rPr/>
+      </w:r>
+      <w:r>
+        <w:rPr>
+          <w:b/>
+        </w:rPr>
+        <w:t>Example:</w:t>
+      </w:r>
+      <w:r>
+        <w:rPr/>
+        <w:t xml:space="preserve"> Behind schedule before a client demo, you split must-haves from nice-to-haves and agreed the cut with the PM.</w:t>
+      </w:r>
+    </w:p>
+    <w:p>
+      <w:r>
+        <w:rPr/>
+      </w:r>
+      <w:r>
+        <w:rPr>
+          <w:b/>
+        </w:rPr>
+        <w:t>Say it like this:</w:t>
       </w:r>
       <w:r>
         <w:rPr/>
@@ -2522,7 +2943,52 @@
         <w:rPr>
           <w:b/>
         </w:rPr>
-        <w:t>Sample answer:</w:t>
+        <w:t>Short answer:</w:t>
+      </w:r>
+      <w:r>
+        <w:rPr/>
+        <w:t xml:space="preserve"> Release notes, small experiments before production use, reading postmortems, and writing internal docs.</w:t>
+      </w:r>
+    </w:p>
+    <w:p>
+      <w:r>
+        <w:rPr/>
+      </w:r>
+      <w:r>
+        <w:rPr>
+          <w:b/>
+        </w:rPr>
+        <w:t>Explanation:</w:t>
+      </w:r>
+      <w:r>
+        <w:rPr/>
+        <w:t xml:space="preserve"> Show a habit, not a list of courses, and ideally a recent example of something you learned and applied.</w:t>
+      </w:r>
+    </w:p>
+    <w:p>
+      <w:r>
+        <w:rPr/>
+      </w:r>
+      <w:r>
+        <w:rPr>
+          <w:b/>
+        </w:rPr>
+        <w:t>Example:</w:t>
+      </w:r>
+      <w:r>
+        <w:rPr/>
+        <w:t xml:space="preserve"> Trying React 19 Actions in a side project before proposing them at work.</w:t>
+      </w:r>
+    </w:p>
+    <w:p>
+      <w:r>
+        <w:rPr/>
+      </w:r>
+      <w:r>
+        <w:rPr>
+          <w:b/>
+        </w:rPr>
+        <w:t>Say it like this:</w:t>
       </w:r>
       <w:r>
         <w:rPr/>
@@ -2570,11 +3036,56 @@
         <w:rPr>
           <w:b/>
         </w:rPr>
-        <w:t>Approach:</w:t>
-      </w:r>
-      <w:r>
-        <w:rPr/>
-        <w:t xml:space="preserve"> Be honest about your notice period, research market ranges, give a range anchored on the scope of the role, and state your flexibility clearly.</w:t>
+        <w:t>Short answer:</w:t>
+      </w:r>
+      <w:r>
+        <w:rPr/>
+        <w:t xml:space="preserve"> Be honest about your notice period, give a researched range based on the role's scope, and state your flexibility clearly.</w:t>
+      </w:r>
+    </w:p>
+    <w:p>
+      <w:r>
+        <w:rPr/>
+      </w:r>
+      <w:r>
+        <w:rPr>
+          <w:b/>
+        </w:rPr>
+        <w:t>Explanation:</w:t>
+      </w:r>
+      <w:r>
+        <w:rPr/>
+        <w:t xml:space="preserve"> Research market ranges for the level and city beforehand. Giving a range anchored on scope avoids underselling, and being clear about flexibility avoids surprises later.</w:t>
+      </w:r>
+    </w:p>
+    <w:p>
+      <w:r>
+        <w:rPr/>
+      </w:r>
+      <w:r>
+        <w:rPr>
+          <w:b/>
+        </w:rPr>
+        <w:t>Example:</w:t>
+      </w:r>
+      <w:r>
+        <w:rPr/>
+        <w:t xml:space="preserve"> "My notice period is [X] days, [negotiable / with buyout possible]. Based on the scope of this role, I'm looking at [range]. I'm open to [relocation / hybrid]."</w:t>
+      </w:r>
+    </w:p>
+    <w:p>
+      <w:r>
+        <w:rPr/>
+      </w:r>
+      <w:r>
+        <w:rPr>
+          <w:b/>
+        </w:rPr>
+        <w:t>Say it like this:</w:t>
+      </w:r>
+      <w:r>
+        <w:rPr/>
+        <w:t xml:space="preserve"> "My notice period is [X days]. For compensation, based on the scope of the role and market research, I'm looking at [range], and I'm flexible depending on the overall package. I'm open to [relocation / hybrid work]."</w:t>
       </w:r>
     </w:p>
     <w:p>
@@ -2618,7 +3129,52 @@
         <w:rPr>
           <w:b/>
         </w:rPr>
-        <w:t>Sample answer:</w:t>
+        <w:t>Short answer:</w:t>
+      </w:r>
+      <w:r>
+        <w:rPr/>
+        <w:t xml:space="preserve"> Give the factual reason briefly, then focus on what you learned and how it helped later.</w:t>
+      </w:r>
+    </w:p>
+    <w:p>
+      <w:r>
+        <w:rPr/>
+      </w:r>
+      <w:r>
+        <w:rPr>
+          <w:b/>
+        </w:rPr>
+        <w:t>Explanation:</w:t>
+      </w:r>
+      <w:r>
+        <w:rPr/>
+        <w:t xml:space="preserve"> Don't be defensive or over-explain. A short, honest answer followed by learning shows maturity.</w:t>
+      </w:r>
+    </w:p>
+    <w:p>
+      <w:r>
+        <w:rPr/>
+      </w:r>
+      <w:r>
+        <w:rPr>
+          <w:b/>
+        </w:rPr>
+        <w:t>Example:</w:t>
+      </w:r>
+      <w:r>
+        <w:rPr/>
+        <w:t xml:space="preserve"> The roughly six-month Slaylink role, where you owned a product end to end with Next.js, NestJS and GraphQL.</w:t>
+      </w:r>
+    </w:p>
+    <w:p>
+      <w:r>
+        <w:rPr/>
+      </w:r>
+      <w:r>
+        <w:rPr>
+          <w:b/>
+        </w:rPr>
+        <w:t>Say it like this:</w:t>
       </w:r>
       <w:r>
         <w:rPr/>
@@ -2679,11 +3235,11 @@
         <w:rPr>
           <w:b/>
         </w:rPr>
-        <w:t>Approach:</w:t>
-      </w:r>
-      <w:r>
-        <w:rPr/>
-        <w:t xml:space="preserve"> Show that you disagreed with data, listened, proposed an experiment or compromise, and committed once the decision was made.</w:t>
+        <w:t>Short answer:</w:t>
+      </w:r>
+      <w:r>
+        <w:rPr/>
+        <w:t xml:space="preserve"> I disagreed with data, proposed a compromise, and committed once the decision was made.</w:t>
       </w:r>
     </w:p>
     <w:p>
@@ -2694,7 +3250,37 @@
         <w:rPr>
           <w:b/>
         </w:rPr>
-        <w:t>Sample answer:</w:t>
+        <w:t>Explanation:</w:t>
+      </w:r>
+      <w:r>
+        <w:rPr/>
+        <w:t xml:space="preserve"> They're testing whether you can push back respectfully and then commit. Show that you listened, quantified the risk, offered options, and didn't make it personal.</w:t>
+      </w:r>
+    </w:p>
+    <w:p>
+      <w:r>
+        <w:rPr/>
+      </w:r>
+      <w:r>
+        <w:rPr>
+          <w:b/>
+        </w:rPr>
+        <w:t>Example:</w:t>
+      </w:r>
+      <w:r>
+        <w:rPr/>
+        <w:t xml:space="preserve"> A PM wanted to ship without tests or accessibility support; you proposed shipping behind a feature flag with tests before full rollout.</w:t>
+      </w:r>
+    </w:p>
+    <w:p>
+      <w:r>
+        <w:rPr/>
+      </w:r>
+      <w:r>
+        <w:rPr>
+          <w:b/>
+        </w:rPr>
+        <w:t>Say it like this:</w:t>
       </w:r>
       <w:r>
         <w:rPr/>
@@ -2743,11 +3329,11 @@
         <w:rPr>
           <w:b/>
         </w:rPr>
-        <w:t>Approach:</w:t>
-      </w:r>
-      <w:r>
-        <w:rPr/>
-        <w:t xml:space="preserve"> Own it fast, mitigate, communicate, find the root cause, and prevent it happening again.</w:t>
+        <w:t>Short answer:</w:t>
+      </w:r>
+      <w:r>
+        <w:rPr/>
+        <w:t xml:space="preserve"> I owned it immediately, mitigated, communicated, fixed the root cause and prevented a repeat.</w:t>
       </w:r>
     </w:p>
     <w:p>
@@ -2758,7 +3344,37 @@
         <w:rPr>
           <w:b/>
         </w:rPr>
-        <w:t>Sample answer:</w:t>
+        <w:t>Explanation:</w:t>
+      </w:r>
+      <w:r>
+        <w:rPr/>
+        <w:t xml:space="preserve"> They're testing accountability. Spend little time on the mistake and most on the response and the lasting fix. Never blame others.</w:t>
+      </w:r>
+    </w:p>
+    <w:p>
+      <w:r>
+        <w:rPr/>
+      </w:r>
+      <w:r>
+        <w:rPr>
+          <w:b/>
+        </w:rPr>
+        <w:t>Example:</w:t>
+      </w:r>
+      <w:r>
+        <w:rPr/>
+        <w:t xml:space="preserve"> A change to reconnect logic or caching that affected some users, rolled back within minutes.</w:t>
+      </w:r>
+    </w:p>
+    <w:p>
+      <w:r>
+        <w:rPr/>
+      </w:r>
+      <w:r>
+        <w:rPr>
+          <w:b/>
+        </w:rPr>
+        <w:t>Say it like this:</w:t>
       </w:r>
       <w:r>
         <w:rPr/>
@@ -2806,7 +3422,52 @@
         <w:rPr>
           <w:b/>
         </w:rPr>
-        <w:t>Sample answer:</w:t>
+        <w:t>Short answer:</w:t>
+      </w:r>
+      <w:r>
+        <w:rPr/>
+        <w:t xml:space="preserve"> I underestimated a risk, raised it later than I should have, offered options, and changed how I estimate.</w:t>
+      </w:r>
+    </w:p>
+    <w:p>
+      <w:r>
+        <w:rPr/>
+      </w:r>
+      <w:r>
+        <w:rPr>
+          <w:b/>
+        </w:rPr>
+        <w:t>Explanation:</w:t>
+      </w:r>
+      <w:r>
+        <w:rPr/>
+        <w:t xml:space="preserve"> Honesty about your part, plus a concrete change in behaviour, is what they want to hear.</w:t>
+      </w:r>
+    </w:p>
+    <w:p>
+      <w:r>
+        <w:rPr/>
+      </w:r>
+      <w:r>
+        <w:rPr>
+          <w:b/>
+        </w:rPr>
+        <w:t>Example:</w:t>
+      </w:r>
+      <w:r>
+        <w:rPr/>
+        <w:t xml:space="preserve"> A third-party API that behaved differently from its documentation.</w:t>
+      </w:r>
+    </w:p>
+    <w:p>
+      <w:r>
+        <w:rPr/>
+      </w:r>
+      <w:r>
+        <w:rPr>
+          <w:b/>
+        </w:rPr>
+        <w:t>Say it like this:</w:t>
       </w:r>
       <w:r>
         <w:rPr/>
@@ -2855,7 +3516,52 @@
         <w:rPr>
           <w:b/>
         </w:rPr>
-        <w:t>Sample answer:</w:t>
+        <w:t>Short answer:</w:t>
+      </w:r>
+      <w:r>
+        <w:rPr/>
+        <w:t xml:space="preserve"> I turned a vague requirement into a testable checklist by asking the right question and prototyping.</w:t>
+      </w:r>
+    </w:p>
+    <w:p>
+      <w:r>
+        <w:rPr/>
+      </w:r>
+      <w:r>
+        <w:rPr>
+          <w:b/>
+        </w:rPr>
+        <w:t>Explanation:</w:t>
+      </w:r>
+      <w:r>
+        <w:rPr/>
+        <w:t xml:space="preserve"> They're testing how you handle ambiguity: clarify the goal, make it concrete, and get agreement early.</w:t>
+      </w:r>
+    </w:p>
+    <w:p>
+      <w:r>
+        <w:rPr/>
+      </w:r>
+      <w:r>
+        <w:rPr>
+          <w:b/>
+        </w:rPr>
+        <w:t>Example:</w:t>
+      </w:r>
+      <w:r>
+        <w:rPr/>
+        <w:t xml:space="preserve"> "Make it accessible" became WCAG 2.1 AA, a prototype, and sign-off.</w:t>
+      </w:r>
+    </w:p>
+    <w:p>
+      <w:r>
+        <w:rPr/>
+      </w:r>
+      <w:r>
+        <w:rPr>
+          <w:b/>
+        </w:rPr>
+        <w:t>Say it like this:</w:t>
       </w:r>
       <w:r>
         <w:rPr/>
@@ -2904,7 +3610,52 @@
         <w:rPr>
           <w:b/>
         </w:rPr>
-        <w:t>Sample answer:</w:t>
+        <w:t>Short answer:</w:t>
+      </w:r>
+      <w:r>
+        <w:rPr/>
+        <w:t xml:space="preserve"> Learn the fundamentals, build a throwaway prototype, then design the real thing.</w:t>
+      </w:r>
+    </w:p>
+    <w:p>
+      <w:r>
+        <w:rPr/>
+      </w:r>
+      <w:r>
+        <w:rPr>
+          <w:b/>
+        </w:rPr>
+        <w:t>Explanation:</w:t>
+      </w:r>
+      <w:r>
+        <w:rPr/>
+        <w:t xml:space="preserve"> Show a learning method and a result within a timeframe.</w:t>
+      </w:r>
+    </w:p>
+    <w:p>
+      <w:r>
+        <w:rPr/>
+      </w:r>
+      <w:r>
+        <w:rPr>
+          <w:b/>
+        </w:rPr>
+        <w:t>Example:</w:t>
+      </w:r>
+      <w:r>
+        <w:rPr/>
+        <w:t xml:space="preserve"> WebRTC and LiveKit for InterpretIQ.</w:t>
+      </w:r>
+    </w:p>
+    <w:p>
+      <w:r>
+        <w:rPr/>
+      </w:r>
+      <w:r>
+        <w:rPr>
+          <w:b/>
+        </w:rPr>
+        <w:t>Say it like this:</w:t>
       </w:r>
       <w:r>
         <w:rPr/>
@@ -2948,7 +3699,61 @@
     <w:p>
       <w:r>
         <w:rPr/>
-        <w:t>Use the testing-standards story, with the before and after metrics.</w:t>
+      </w:r>
+      <w:r>
+        <w:rPr>
+          <w:b/>
+        </w:rPr>
+        <w:t>Short answer:</w:t>
+      </w:r>
+      <w:r>
+        <w:rPr/>
+        <w:t xml:space="preserve"> Introducing testing standards across 15 developers, which cut production bugs by 30%.</w:t>
+      </w:r>
+    </w:p>
+    <w:p>
+      <w:r>
+        <w:rPr/>
+      </w:r>
+      <w:r>
+        <w:rPr>
+          <w:b/>
+        </w:rPr>
+        <w:t>Explanation:</w:t>
+      </w:r>
+      <w:r>
+        <w:rPr/>
+        <w:t xml:space="preserve"> Use the before and after metrics, and show how you got people to adopt the change rather than just announcing it.</w:t>
+      </w:r>
+    </w:p>
+    <w:p>
+      <w:r>
+        <w:rPr/>
+      </w:r>
+      <w:r>
+        <w:rPr>
+          <w:b/>
+        </w:rPr>
+        <w:t>Example:</w:t>
+      </w:r>
+      <w:r>
+        <w:rPr/>
+        <w:t xml:space="preserve"> Guidelines with real examples, templates, workshops, pairing, gradually stricter CI checks, and a regression-test rule for bug fixes.</w:t>
+      </w:r>
+    </w:p>
+    <w:p>
+      <w:r>
+        <w:rPr/>
+      </w:r>
+      <w:r>
+        <w:rPr>
+          <w:b/>
+        </w:rPr>
+        <w:t>Say it like this:</w:t>
+      </w:r>
+      <w:r>
+        <w:rPr/>
+        <w:t xml:space="preserve"> "Production bugs kept slipping through and testing varied a lot between developers. I wrote a short guide with examples from our own code, added templates, ran two workshops and paired on first tests. Then I tightened CI gradually, starting with auth and the call flow. Production bugs dropped by 30%, and people started reviewing each other's tests on their own."</w:t>
       </w:r>
     </w:p>
     <w:p>
@@ -2988,7 +3793,61 @@
     <w:p>
       <w:r>
         <w:rPr/>
-        <w:t>Use the security audit. Emphasise that it wasn't assigned: you saw the risk and acted.</w:t>
+      </w:r>
+      <w:r>
+        <w:rPr>
+          <w:b/>
+        </w:rPr>
+        <w:t>Short answer:</w:t>
+      </w:r>
+      <w:r>
+        <w:rPr/>
+        <w:t xml:space="preserve"> The security audit: nobody assigned it, but I saw the risk and drove it to completion.</w:t>
+      </w:r>
+    </w:p>
+    <w:p>
+      <w:r>
+        <w:rPr/>
+      </w:r>
+      <w:r>
+        <w:rPr>
+          <w:b/>
+        </w:rPr>
+        <w:t>Explanation:</w:t>
+      </w:r>
+      <w:r>
+        <w:rPr/>
+        <w:t xml:space="preserve"> Emphasise that it wasn't assigned, why it mattered (PHI in a healthcare app), and that you followed through, not just raised concerns.</w:t>
+      </w:r>
+    </w:p>
+    <w:p>
+      <w:r>
+        <w:rPr/>
+      </w:r>
+      <w:r>
+        <w:rPr>
+          <w:b/>
+        </w:rPr>
+        <w:t>Example:</w:t>
+      </w:r>
+      <w:r>
+        <w:rPr/>
+        <w:t xml:space="preserve"> 8 critical issues found, an 85% reduction in findings on re-audit, and authorisation tests added to CI.</w:t>
+      </w:r>
+    </w:p>
+    <w:p>
+      <w:r>
+        <w:rPr/>
+      </w:r>
+      <w:r>
+        <w:rPr>
+          <w:b/>
+        </w:rPr>
+        <w:t>Say it like this:</w:t>
+      </w:r>
+      <w:r>
+        <w:rPr/>
+        <w:t xml:space="preserve"> "Nobody asked me to audit security, but InterpretIQ handles patient data and our access control had grown without review. I mapped every role, tested every endpoint as each role, and checked where tokens and PHI ended up. We found 8 critical issues, fixed them in priority order with the backend developers, and the re-audit showed 85% fewer findings. I then added authorisation tests to CI so they couldn't return."</w:t>
       </w:r>
     </w:p>
     <w:p>
@@ -3032,7 +3891,52 @@
         <w:rPr>
           <w:b/>
         </w:rPr>
-        <w:t>Sample answer:</w:t>
+        <w:t>Short answer:</w:t>
+      </w:r>
+      <w:r>
+        <w:rPr/>
+        <w:t xml:space="preserve"> I found the real worry behind the behaviour and agreed a process that addressed it.</w:t>
+      </w:r>
+    </w:p>
+    <w:p>
+      <w:r>
+        <w:rPr/>
+      </w:r>
+      <w:r>
+        <w:rPr>
+          <w:b/>
+        </w:rPr>
+        <w:t>Explanation:</w:t>
+      </w:r>
+      <w:r>
+        <w:rPr/>
+        <w:t xml:space="preserve"> Show empathy (understand their goal), then structure (priorities and a clear channel), and the outcome.</w:t>
+      </w:r>
+    </w:p>
+    <w:p>
+      <w:r>
+        <w:rPr/>
+      </w:r>
+      <w:r>
+        <w:rPr>
+          <w:b/>
+        </w:rPr>
+        <w:t>Example:</w:t>
+      </w:r>
+      <w:r>
+        <w:rPr/>
+        <w:t xml:space="preserve"> A client stakeholder sending urgent requests directly to developers before a leadership demo.</w:t>
+      </w:r>
+    </w:p>
+    <w:p>
+      <w:r>
+        <w:rPr/>
+      </w:r>
+      <w:r>
+        <w:rPr>
+          <w:b/>
+        </w:rPr>
+        <w:t>Say it like this:</w:t>
       </w:r>
       <w:r>
         <w:rPr/>
@@ -3080,7 +3984,52 @@
         <w:rPr>
           <w:b/>
         </w:rPr>
-        <w:t>Sample answer:</w:t>
+        <w:t>Short answer:</w:t>
+      </w:r>
+      <w:r>
+        <w:rPr/>
+        <w:t xml:space="preserve"> I said no to the risky solution, but yes to the goal, by offering a safer alternative.</w:t>
+      </w:r>
+    </w:p>
+    <w:p>
+      <w:r>
+        <w:rPr/>
+      </w:r>
+      <w:r>
+        <w:rPr>
+          <w:b/>
+        </w:rPr>
+        <w:t>Explanation:</w:t>
+      </w:r>
+      <w:r>
+        <w:rPr/>
+        <w:t xml:space="preserve"> A good "no" explains the risk clearly and still solves the underlying problem.</w:t>
+      </w:r>
+    </w:p>
+    <w:p>
+      <w:r>
+        <w:rPr/>
+      </w:r>
+      <w:r>
+        <w:rPr>
+          <w:b/>
+        </w:rPr>
+        <w:t>Example:</w:t>
+      </w:r>
+      <w:r>
+        <w:rPr/>
+        <w:t xml:space="preserve"> A request to store patient details in the browser for faster offline loading.</w:t>
+      </w:r>
+    </w:p>
+    <w:p>
+      <w:r>
+        <w:rPr/>
+      </w:r>
+      <w:r>
+        <w:rPr>
+          <w:b/>
+        </w:rPr>
+        <w:t>Say it like this:</w:t>
       </w:r>
       <w:r>
         <w:rPr/>
@@ -3128,7 +4077,52 @@
         <w:rPr>
           <w:b/>
         </w:rPr>
-        <w:t>Sample answer:</w:t>
+        <w:t>Short answer:</w:t>
+      </w:r>
+      <w:r>
+        <w:rPr/>
+        <w:t xml:space="preserve"> I accepted it, changed my behaviour, and the result was visible.</w:t>
+      </w:r>
+    </w:p>
+    <w:p>
+      <w:r>
+        <w:rPr/>
+      </w:r>
+      <w:r>
+        <w:rPr>
+          <w:b/>
+        </w:rPr>
+        <w:t>Explanation:</w:t>
+      </w:r>
+      <w:r>
+        <w:rPr/>
+        <w:t xml:space="preserve"> They're testing coachability. Don't be defensive in the story, and show a specific change.</w:t>
+      </w:r>
+    </w:p>
+    <w:p>
+      <w:r>
+        <w:rPr/>
+      </w:r>
+      <w:r>
+        <w:rPr>
+          <w:b/>
+        </w:rPr>
+        <w:t>Example:</w:t>
+      </w:r>
+      <w:r>
+        <w:rPr/>
+        <w:t xml:space="preserve"> Feedback that your PR reviews were too blunt.</w:t>
+      </w:r>
+    </w:p>
+    <w:p>
+      <w:r>
+        <w:rPr/>
+      </w:r>
+      <w:r>
+        <w:rPr>
+          <w:b/>
+        </w:rPr>
+        <w:t>Say it like this:</w:t>
       </w:r>
       <w:r>
         <w:rPr/>
@@ -3186,7 +4180,52 @@
         <w:rPr>
           <w:b/>
         </w:rPr>
-        <w:t>Sample answer:</w:t>
+        <w:t>Short answer:</w:t>
+      </w:r>
+      <w:r>
+        <w:rPr/>
+        <w:t xml:space="preserve"> Privately, specifically, with curiosity about the cause, and with support to improve.</w:t>
+      </w:r>
+    </w:p>
+    <w:p>
+      <w:r>
+        <w:rPr/>
+      </w:r>
+      <w:r>
+        <w:rPr>
+          <w:b/>
+        </w:rPr>
+        <w:t>Explanation:</w:t>
+      </w:r>
+      <w:r>
+        <w:rPr/>
+        <w:t xml:space="preserve"> Show that you looked for the root cause rather than just criticising, and that you followed up.</w:t>
+      </w:r>
+    </w:p>
+    <w:p>
+      <w:r>
+        <w:rPr/>
+      </w:r>
+      <w:r>
+        <w:rPr>
+          <w:b/>
+        </w:rPr>
+        <w:t>Example:</w:t>
+      </w:r>
+      <w:r>
+        <w:rPr/>
+        <w:t xml:space="preserve"> A developer repeatedly shipping PRs without tests.</w:t>
+      </w:r>
+    </w:p>
+    <w:p>
+      <w:r>
+        <w:rPr/>
+      </w:r>
+      <w:r>
+        <w:rPr>
+          <w:b/>
+        </w:rPr>
+        <w:t>Say it like this:</w:t>
       </w:r>
       <w:r>
         <w:rPr/>
@@ -3234,7 +4273,52 @@
         <w:rPr>
           <w:b/>
         </w:rPr>
-        <w:t>Sample answer:</w:t>
+        <w:t>Short answer:</w:t>
+      </w:r>
+      <w:r>
+        <w:rPr/>
+        <w:t xml:space="preserve"> Understand the blockers first, support with clear expectations, and escalate with evidence only if that fails.</w:t>
+      </w:r>
+    </w:p>
+    <w:p>
+      <w:r>
+        <w:rPr/>
+      </w:r>
+      <w:r>
+        <w:rPr>
+          <w:b/>
+        </w:rPr>
+        <w:t>Explanation:</w:t>
+      </w:r>
+      <w:r>
+        <w:rPr/>
+        <w:t xml:space="preserve"> Show fairness and structure: diagnosis, support, measurable expectations, and a clear next step.</w:t>
+      </w:r>
+    </w:p>
+    <w:p>
+      <w:r>
+        <w:rPr/>
+      </w:r>
+      <w:r>
+        <w:rPr>
+          <w:b/>
+        </w:rPr>
+        <w:t>Example:</w:t>
+      </w:r>
+      <w:r>
+        <w:rPr/>
+        <w:t xml:space="preserve"> A teammate repeatedly missing estimates because they were stuck on unfamiliar code.</w:t>
+      </w:r>
+    </w:p>
+    <w:p>
+      <w:r>
+        <w:rPr/>
+      </w:r>
+      <w:r>
+        <w:rPr>
+          <w:b/>
+        </w:rPr>
+        <w:t>Say it like this:</w:t>
       </w:r>
       <w:r>
         <w:rPr/>
@@ -3282,7 +4366,52 @@
         <w:rPr>
           <w:b/>
         </w:rPr>
-        <w:t>Sample answer:</w:t>
+        <w:t>Short answer:</w:t>
+      </w:r>
+      <w:r>
+        <w:rPr/>
+        <w:t xml:space="preserve"> Prioritise by impact and risk, tell affected people immediately, and delegate well-defined work.</w:t>
+      </w:r>
+    </w:p>
+    <w:p>
+      <w:r>
+        <w:rPr/>
+      </w:r>
+      <w:r>
+        <w:rPr>
+          <w:b/>
+        </w:rPr>
+        <w:t>Explanation:</w:t>
+      </w:r>
+      <w:r>
+        <w:rPr/>
+        <w:t xml:space="preserve"> Show a clear prioritisation principle and proactive communication.</w:t>
+      </w:r>
+    </w:p>
+    <w:p>
+      <w:r>
+        <w:rPr/>
+      </w:r>
+      <w:r>
+        <w:rPr>
+          <w:b/>
+        </w:rPr>
+        <w:t>Example:</w:t>
+      </w:r>
+      <w:r>
+        <w:rPr/>
+        <w:t xml:space="preserve"> A live-call reconnect bug in InterpretIQ in the same week as a BpoBox deadline.</w:t>
+      </w:r>
+    </w:p>
+    <w:p>
+      <w:r>
+        <w:rPr/>
+      </w:r>
+      <w:r>
+        <w:rPr>
+          <w:b/>
+        </w:rPr>
+        <w:t>Say it like this:</w:t>
       </w:r>
       <w:r>
         <w:rPr/>
@@ -3326,7 +4455,61 @@
     <w:p>
       <w:r>
         <w:rPr/>
-        <w:t>Use the self-hosting story: what you knew, your assumptions, how you limited risk (reversible steps, pilots), and the outcome.</w:t>
+      </w:r>
+      <w:r>
+        <w:rPr>
+          <w:b/>
+        </w:rPr>
+        <w:t>Short answer:</w:t>
+      </w:r>
+      <w:r>
+        <w:rPr/>
+        <w:t xml:space="preserve"> The self-hosting decision: state assumptions explicitly, and make the decision reversible through phases.</w:t>
+      </w:r>
+    </w:p>
+    <w:p>
+      <w:r>
+        <w:rPr/>
+      </w:r>
+      <w:r>
+        <w:rPr>
+          <w:b/>
+        </w:rPr>
+        <w:t>Explanation:</w:t>
+      </w:r>
+      <w:r>
+        <w:rPr/>
+        <w:t xml:space="preserve"> Cover what you knew, what you assumed, how you limited the risk (pilots, rollback) and the outcome. Present projections as projections.</w:t>
+      </w:r>
+    </w:p>
+    <w:p>
+      <w:r>
+        <w:rPr/>
+      </w:r>
+      <w:r>
+        <w:rPr>
+          <w:b/>
+        </w:rPr>
+        <w:t>Example:</w:t>
+      </w:r>
+      <w:r>
+        <w:rPr/>
+        <w:t xml:space="preserve"> A cost model of managed vs self-hosted LiveKit, with a phased rollout and rollback path.</w:t>
+      </w:r>
+    </w:p>
+    <w:p>
+      <w:r>
+        <w:rPr/>
+      </w:r>
+      <w:r>
+        <w:rPr>
+          <w:b/>
+        </w:rPr>
+        <w:t>Say it like this:</w:t>
+      </w:r>
+      <w:r>
+        <w:rPr/>
+        <w:t xml:space="preserve"> "Leadership asked whether we should self-host video. I built a cost model including the operational time, not just servers, and wrote down the assumptions about usage and growth. Because the data was incomplete, I proposed a phased rollout, [staging first, then a share of traffic], with a rollback path. The projection showed about 40% savings, and we planned load tests to validate the assumptions before committing fully."</w:t>
       </w:r>
     </w:p>
     <w:p>
@@ -3370,7 +4553,64 @@
         <w:rPr>
           <w:b/>
         </w:rPr>
-        <w:t>Sample answer:</w:t>
+        <w:t>Short answer:</w:t>
+      </w:r>
+      <w:r>
+        <w:rPr/>
+        <w:t xml:space="preserve"> I replaced scattered hand-written data fetching with a query library, starting with one example migration.</w:t>
+      </w:r>
+    </w:p>
+    <w:p>
+      <w:r>
+        <w:rPr/>
+      </w:r>
+      <w:r>
+        <w:rPr>
+          <w:b/>
+        </w:rPr>
+        <w:t>Explanation:</w:t>
+      </w:r>
+      <w:r>
+        <w:rPr/>
+        <w:t xml:space="preserve"> Show the before (complexity and bugs), the approach (example plus guide), and the after (less code, fewer bugs).</w:t>
+      </w:r>
+    </w:p>
+    <w:p>
+      <w:r>
+        <w:rPr/>
+      </w:r>
+      <w:r>
+        <w:rPr>
+          <w:b/>
+        </w:rPr>
+        <w:t>Example:</w:t>
+      </w:r>
+      <w:r>
+        <w:rPr/>
+        <w:t xml:space="preserve"> </w:t>
+      </w:r>
+      <w:r>
+        <w:rPr>
+          <w:rFonts w:ascii="Courier New" w:hAnsi="Courier New"/>
+          <w:color w:val="B42318"/>
+          <w:sz w:val="20"/>
+        </w:rPr>
+        <w:t>useEffect</w:t>
+      </w:r>
+      <w:r>
+        <w:rPr/>
+        <w:t xml:space="preserve"> fetching with loading flags and race conditions replaced by a query library.</w:t>
+      </w:r>
+    </w:p>
+    <w:p>
+      <w:r>
+        <w:rPr/>
+      </w:r>
+      <w:r>
+        <w:rPr>
+          <w:b/>
+        </w:rPr>
+        <w:t>Say it like this:</w:t>
       </w:r>
       <w:r>
         <w:rPr/>
@@ -3430,7 +4670,52 @@
         <w:rPr>
           <w:b/>
         </w:rPr>
-        <w:t>Sample answer:</w:t>
+        <w:t>Short answer:</w:t>
+      </w:r>
+      <w:r>
+        <w:rPr/>
+        <w:t xml:space="preserve"> Mitigate first, communicate regularly, then run a blameless postmortem with tracked actions.</w:t>
+      </w:r>
+    </w:p>
+    <w:p>
+      <w:r>
+        <w:rPr/>
+      </w:r>
+      <w:r>
+        <w:rPr>
+          <w:b/>
+        </w:rPr>
+        <w:t>Explanation:</w:t>
+      </w:r>
+      <w:r>
+        <w:rPr/>
+        <w:t xml:space="preserve"> They're testing calm prioritisation: restore service before investigating, and keep stakeholders informed.</w:t>
+      </w:r>
+    </w:p>
+    <w:p>
+      <w:r>
+        <w:rPr/>
+      </w:r>
+      <w:r>
+        <w:rPr>
+          <w:b/>
+        </w:rPr>
+        <w:t>Example:</w:t>
+      </w:r>
+      <w:r>
+        <w:rPr/>
+        <w:t xml:space="preserve"> Calls failing to connect for one region or tenant during business hours.</w:t>
+      </w:r>
+    </w:p>
+    <w:p>
+      <w:r>
+        <w:rPr/>
+      </w:r>
+      <w:r>
+        <w:rPr>
+          <w:b/>
+        </w:rPr>
+        <w:t>Say it like this:</w:t>
       </w:r>
       <w:r>
         <w:rPr/>
@@ -3478,7 +4763,52 @@
         <w:rPr>
           <w:b/>
         </w:rPr>
-        <w:t>Sample answer:</w:t>
+        <w:t>Short answer:</w:t>
+      </w:r>
+      <w:r>
+        <w:rPr/>
+        <w:t xml:space="preserve"> Written design docs, clear ownership, and a short overlap window for decisions.</w:t>
+      </w:r>
+    </w:p>
+    <w:p>
+      <w:r>
+        <w:rPr/>
+      </w:r>
+      <w:r>
+        <w:rPr>
+          <w:b/>
+        </w:rPr>
+        <w:t>Explanation:</w:t>
+      </w:r>
+      <w:r>
+        <w:rPr/>
+        <w:t xml:space="preserve"> Show habits that make distributed work smooth: writing things down, explicit owners, and fewer but better meetings.</w:t>
+      </w:r>
+    </w:p>
+    <w:p>
+      <w:r>
+        <w:rPr/>
+      </w:r>
+      <w:r>
+        <w:rPr>
+          <w:b/>
+        </w:rPr>
+        <w:t>Example:</w:t>
+      </w:r>
+      <w:r>
+        <w:rPr/>
+        <w:t xml:space="preserve"> A shared design doc for the LiveKit infrastructure with backend and DevOps engineers in different locations.</w:t>
+      </w:r>
+    </w:p>
+    <w:p>
+      <w:r>
+        <w:rPr/>
+      </w:r>
+      <w:r>
+        <w:rPr>
+          <w:b/>
+        </w:rPr>
+        <w:t>Say it like this:</w:t>
       </w:r>
       <w:r>
         <w:rPr/>
@@ -3539,7 +4869,52 @@
         <w:rPr>
           <w:b/>
         </w:rPr>
-        <w:t>Sample answer:</w:t>
+        <w:t>Short answer:</w:t>
+      </w:r>
+      <w:r>
+        <w:rPr/>
+        <w:t xml:space="preserve"> Reviews that explain why, pairing on hard problems, involvement in design reviews, and ownership of whole features with support.</w:t>
+      </w:r>
+    </w:p>
+    <w:p>
+      <w:r>
+        <w:rPr/>
+      </w:r>
+      <w:r>
+        <w:rPr>
+          <w:b/>
+        </w:rPr>
+        <w:t>Explanation:</w:t>
+      </w:r>
+      <w:r>
+        <w:rPr/>
+        <w:t xml:space="preserve"> Senior interviews look for multiplying impact. Describe your methods and one person's growth (anonymised).</w:t>
+      </w:r>
+    </w:p>
+    <w:p>
+      <w:r>
+        <w:rPr/>
+      </w:r>
+      <w:r>
+        <w:rPr>
+          <w:b/>
+        </w:rPr>
+        <w:t>Example:</w:t>
+      </w:r>
+      <w:r>
+        <w:rPr/>
+        <w:t xml:space="preserve"> A hesitant developer given ownership of the scorecard module, who later reviewed others' PRs in that area.</w:t>
+      </w:r>
+    </w:p>
+    <w:p>
+      <w:r>
+        <w:rPr/>
+      </w:r>
+      <w:r>
+        <w:rPr>
+          <w:b/>
+        </w:rPr>
+        <w:t>Say it like this:</w:t>
       </w:r>
       <w:r>
         <w:rPr/>
@@ -3597,7 +4972,52 @@
         <w:rPr>
           <w:b/>
         </w:rPr>
-        <w:t>Sample answer:</w:t>
+        <w:t>Short answer:</w:t>
+      </w:r>
+      <w:r>
+        <w:rPr/>
+        <w:t xml:space="preserve"> Define the problem, compare options with trade-offs, spike unknowns, write an RFC or ADR, gather feedback, decide, and record when to revisit.</w:t>
+      </w:r>
+    </w:p>
+    <w:p>
+      <w:r>
+        <w:rPr/>
+      </w:r>
+      <w:r>
+        <w:rPr>
+          <w:b/>
+        </w:rPr>
+        <w:t>Explanation:</w:t>
+      </w:r>
+      <w:r>
+        <w:rPr/>
+        <w:t xml:space="preserve"> They want a repeatable, inclusive process that still reaches a decision.</w:t>
+      </w:r>
+    </w:p>
+    <w:p>
+      <w:r>
+        <w:rPr/>
+      </w:r>
+      <w:r>
+        <w:rPr>
+          <w:b/>
+        </w:rPr>
+        <w:t>Example:</w:t>
+      </w:r>
+      <w:r>
+        <w:rPr/>
+        <w:t xml:space="preserve"> Choosing Redux for session state, RTK Query for data, or self-hosting LiveKit.</w:t>
+      </w:r>
+    </w:p>
+    <w:p>
+      <w:r>
+        <w:rPr/>
+      </w:r>
+      <w:r>
+        <w:rPr>
+          <w:b/>
+        </w:rPr>
+        <w:t>Say it like this:</w:t>
       </w:r>
       <w:r>
         <w:rPr/>
@@ -3645,7 +5065,52 @@
         <w:rPr>
           <w:b/>
         </w:rPr>
-        <w:t>Sample answer:</w:t>
+        <w:t>Short answer:</w:t>
+      </w:r>
+      <w:r>
+        <w:rPr/>
+        <w:t xml:space="preserve"> Classify work by risk: critical paths get full rigour, flagged experiments move faster, and shortcuts are tracked as debt.</w:t>
+      </w:r>
+    </w:p>
+    <w:p>
+      <w:r>
+        <w:rPr/>
+      </w:r>
+      <w:r>
+        <w:rPr>
+          <w:b/>
+        </w:rPr>
+        <w:t>Explanation:</w:t>
+      </w:r>
+      <w:r>
+        <w:rPr/>
+        <w:t xml:space="preserve"> "Always quality" or "always speed" are both weak answers. Show a risk-based framework.</w:t>
+      </w:r>
+    </w:p>
+    <w:p>
+      <w:r>
+        <w:rPr/>
+      </w:r>
+      <w:r>
+        <w:rPr>
+          <w:b/>
+        </w:rPr>
+        <w:t>Example:</w:t>
+      </w:r>
+      <w:r>
+        <w:rPr/>
+        <w:t xml:space="preserve"> Auth, PHI and the call flow get thorough tests; a feature-flagged dashboard experiment gets lighter testing.</w:t>
+      </w:r>
+    </w:p>
+    <w:p>
+      <w:r>
+        <w:rPr/>
+      </w:r>
+      <w:r>
+        <w:rPr>
+          <w:b/>
+        </w:rPr>
+        <w:t>Say it like this:</w:t>
       </w:r>
       <w:r>
         <w:rPr/>
@@ -3693,7 +5158,52 @@
         <w:rPr>
           <w:b/>
         </w:rPr>
-        <w:t>Sample answer:</w:t>
+        <w:t>Short answer:</w:t>
+      </w:r>
+      <w:r>
+        <w:rPr/>
+        <w:t xml:space="preserve"> Make it visible, tie it to business impact, reserve capacity, and fix opportunistically.</w:t>
+      </w:r>
+    </w:p>
+    <w:p>
+      <w:r>
+        <w:rPr/>
+      </w:r>
+      <w:r>
+        <w:rPr>
+          <w:b/>
+        </w:rPr>
+        <w:t>Explanation:</w:t>
+      </w:r>
+      <w:r>
+        <w:rPr/>
+        <w:t xml:space="preserve"> Debt gets prioritised when it's linked to incidents or slower delivery, not when it's described as ugly code.</w:t>
+      </w:r>
+    </w:p>
+    <w:p>
+      <w:r>
+        <w:rPr/>
+      </w:r>
+      <w:r>
+        <w:rPr>
+          <w:b/>
+        </w:rPr>
+        <w:t>Example:</w:t>
+      </w:r>
+      <w:r>
+        <w:rPr/>
+        <w:t xml:space="preserve"> A debt list where each item notes the incidents or delays it caused.</w:t>
+      </w:r>
+    </w:p>
+    <w:p>
+      <w:r>
+        <w:rPr/>
+      </w:r>
+      <w:r>
+        <w:rPr>
+          <w:b/>
+        </w:rPr>
+        <w:t>Say it like this:</w:t>
       </w:r>
       <w:r>
         <w:rPr/>
@@ -3741,7 +5251,52 @@
         <w:rPr>
           <w:b/>
         </w:rPr>
-        <w:t>Sample answer:</w:t>
+        <w:t>Short answer:</w:t>
+      </w:r>
+      <w:r>
+        <w:rPr/>
+        <w:t xml:space="preserve"> Break it down, spike the unknowns, give ranges, and update early when scope changes.</w:t>
+      </w:r>
+    </w:p>
+    <w:p>
+      <w:r>
+        <w:rPr/>
+      </w:r>
+      <w:r>
+        <w:rPr>
+          <w:b/>
+        </w:rPr>
+        <w:t>Explanation:</w:t>
+      </w:r>
+      <w:r>
+        <w:rPr/>
+        <w:t xml:space="preserve"> Good estimation is about managing uncertainty and communicating it, not guessing perfectly.</w:t>
+      </w:r>
+    </w:p>
+    <w:p>
+      <w:r>
+        <w:rPr/>
+      </w:r>
+      <w:r>
+        <w:rPr>
+          <w:b/>
+        </w:rPr>
+        <w:t>Example:</w:t>
+      </w:r>
+      <w:r>
+        <w:rPr/>
+        <w:t xml:space="preserve"> "3–5 days, with the risk in the payment provider's sandbox; I'll confirm after a one-day spike."</w:t>
+      </w:r>
+    </w:p>
+    <w:p>
+      <w:r>
+        <w:rPr/>
+      </w:r>
+      <w:r>
+        <w:rPr>
+          <w:b/>
+        </w:rPr>
+        <w:t>Say it like this:</w:t>
       </w:r>
       <w:r>
         <w:rPr/>
@@ -3789,7 +5344,52 @@
         <w:rPr>
           <w:b/>
         </w:rPr>
-        <w:t>Sample answer:</w:t>
+        <w:t>Short answer:</w:t>
+      </w:r>
+      <w:r>
+        <w:rPr/>
+        <w:t xml:space="preserve"> A working setup doc, an architecture overview, starter tasks and a buddy, aiming for a merged PR in week one.</w:t>
+      </w:r>
+    </w:p>
+    <w:p>
+      <w:r>
+        <w:rPr/>
+      </w:r>
+      <w:r>
+        <w:rPr>
+          <w:b/>
+        </w:rPr>
+        <w:t>Explanation:</w:t>
+      </w:r>
+      <w:r>
+        <w:rPr/>
+        <w:t xml:space="preserve"> Good onboarding is a system that improves each time someone joins.</w:t>
+      </w:r>
+    </w:p>
+    <w:p>
+      <w:r>
+        <w:rPr/>
+      </w:r>
+      <w:r>
+        <w:rPr>
+          <w:b/>
+        </w:rPr>
+        <w:t>Example:</w:t>
+      </w:r>
+      <w:r>
+        <w:rPr/>
+        <w:t xml:space="preserve"> Each new joiner fixes anything wrong in the setup doc as their first PR.</w:t>
+      </w:r>
+    </w:p>
+    <w:p>
+      <w:r>
+        <w:rPr/>
+      </w:r>
+      <w:r>
+        <w:rPr>
+          <w:b/>
+        </w:rPr>
+        <w:t>Say it like this:</w:t>
       </w:r>
       <w:r>
         <w:rPr/>
@@ -3838,7 +5438,52 @@
         <w:rPr>
           <w:b/>
         </w:rPr>
-        <w:t>Sample answer:</w:t>
+        <w:t>Short answer:</w:t>
+      </w:r>
+      <w:r>
+        <w:rPr/>
+        <w:t xml:space="preserve"> Show the pain with data, pilot with volunteers, make it easy, and automate enforcement gradually.</w:t>
+      </w:r>
+    </w:p>
+    <w:p>
+      <w:r>
+        <w:rPr/>
+      </w:r>
+      <w:r>
+        <w:rPr>
+          <w:b/>
+        </w:rPr>
+        <w:t>Explanation:</w:t>
+      </w:r>
+      <w:r>
+        <w:rPr/>
+        <w:t xml:space="preserve"> Adoption comes from making the new way the easy way, not from mandates.</w:t>
+      </w:r>
+    </w:p>
+    <w:p>
+      <w:r>
+        <w:rPr/>
+      </w:r>
+      <w:r>
+        <w:rPr>
+          <w:b/>
+        </w:rPr>
+        <w:t>Example:</w:t>
+      </w:r>
+      <w:r>
+        <w:rPr/>
+        <w:t xml:space="preserve"> The testing standards rollout: templates, workshops, and CI checks introduced module by module.</w:t>
+      </w:r>
+    </w:p>
+    <w:p>
+      <w:r>
+        <w:rPr/>
+      </w:r>
+      <w:r>
+        <w:rPr>
+          <w:b/>
+        </w:rPr>
+        <w:t>Say it like this:</w:t>
       </w:r>
       <w:r>
         <w:rPr/>
@@ -3886,7 +5531,52 @@
         <w:rPr>
           <w:b/>
         </w:rPr>
-        <w:t>Sample answer:</w:t>
+        <w:t>Short answer:</w:t>
+      </w:r>
+      <w:r>
+        <w:rPr/>
+        <w:t xml:space="preserve"> Agree on the criteria first, prototype if it's cheap, decide, document why, and commit.</w:t>
+      </w:r>
+    </w:p>
+    <w:p>
+      <w:r>
+        <w:rPr/>
+      </w:r>
+      <w:r>
+        <w:rPr>
+          <w:b/>
+        </w:rPr>
+        <w:t>Explanation:</w:t>
+      </w:r>
+      <w:r>
+        <w:rPr/>
+        <w:t xml:space="preserve"> Separating criteria from options takes ego out of the discussion.</w:t>
+      </w:r>
+    </w:p>
+    <w:p>
+      <w:r>
+        <w:rPr/>
+      </w:r>
+      <w:r>
+        <w:rPr>
+          <w:b/>
+        </w:rPr>
+        <w:t>Example:</w:t>
+      </w:r>
+      <w:r>
+        <w:rPr/>
+        <w:t xml:space="preserve"> Two developers disagree on Zustand vs Context; the team agrees the criteria are re-render performance and learning curve, then compares.</w:t>
+      </w:r>
+    </w:p>
+    <w:p>
+      <w:r>
+        <w:rPr/>
+      </w:r>
+      <w:r>
+        <w:rPr>
+          <w:b/>
+        </w:rPr>
+        <w:t>Say it like this:</w:t>
       </w:r>
       <w:r>
         <w:rPr/>
@@ -3934,7 +5624,52 @@
         <w:rPr>
           <w:b/>
         </w:rPr>
-        <w:t>Sample answer:</w:t>
+        <w:t>Short answer:</w:t>
+      </w:r>
+      <w:r>
+        <w:rPr/>
+        <w:t xml:space="preserve"> Understand their goals, give early feasibility input, discuss trade-offs openly, and respect role boundaries.</w:t>
+      </w:r>
+    </w:p>
+    <w:p>
+      <w:r>
+        <w:rPr/>
+      </w:r>
+      <w:r>
+        <w:rPr>
+          <w:b/>
+        </w:rPr>
+        <w:t>Explanation:</w:t>
+      </w:r>
+      <w:r>
+        <w:rPr/>
+        <w:t xml:space="preserve"> They want a partner, not an order-taker or a blocker.</w:t>
+      </w:r>
+    </w:p>
+    <w:p>
+      <w:r>
+        <w:rPr/>
+      </w:r>
+      <w:r>
+        <w:rPr>
+          <w:b/>
+        </w:rPr>
+        <w:t>Example:</w:t>
+      </w:r>
+      <w:r>
+        <w:rPr/>
+        <w:t xml:space="preserve"> Suggesting a smaller first version that delivers 80% of the value in half the time.</w:t>
+      </w:r>
+    </w:p>
+    <w:p>
+      <w:r>
+        <w:rPr/>
+      </w:r>
+      <w:r>
+        <w:rPr>
+          <w:b/>
+        </w:rPr>
+        <w:t>Say it like this:</w:t>
       </w:r>
       <w:r>
         <w:rPr/>
@@ -3982,7 +5717,52 @@
         <w:rPr>
           <w:b/>
         </w:rPr>
-        <w:t>Sample answer:</w:t>
+        <w:t>Short answer:</w:t>
+      </w:r>
+      <w:r>
+        <w:rPr/>
+        <w:t xml:space="preserve"> Treat it as a risk: documentation, pairing, rotating ownership and runbooks.</w:t>
+      </w:r>
+    </w:p>
+    <w:p>
+      <w:r>
+        <w:rPr/>
+      </w:r>
+      <w:r>
+        <w:rPr>
+          <w:b/>
+        </w:rPr>
+        <w:t>Explanation:</w:t>
+      </w:r>
+      <w:r>
+        <w:rPr/>
+        <w:t xml:space="preserve"> Seniors reduce the bus factor rather than enjoying being indispensable.</w:t>
+      </w:r>
+    </w:p>
+    <w:p>
+      <w:r>
+        <w:rPr/>
+      </w:r>
+      <w:r>
+        <w:rPr>
+          <w:b/>
+        </w:rPr>
+        <w:t>Example:</w:t>
+      </w:r>
+      <w:r>
+        <w:rPr/>
+        <w:t xml:space="preserve"> A LiveKit runbook plus pairing until two developers could handle incidents alone.</w:t>
+      </w:r>
+    </w:p>
+    <w:p>
+      <w:r>
+        <w:rPr/>
+      </w:r>
+      <w:r>
+        <w:rPr>
+          <w:b/>
+        </w:rPr>
+        <w:t>Say it like this:</w:t>
       </w:r>
       <w:r>
         <w:rPr/>
@@ -4030,7 +5810,76 @@
         <w:rPr>
           <w:b/>
         </w:rPr>
-        <w:t>Sample answer:</w:t>
+        <w:t>Short answer:</w:t>
+      </w:r>
+      <w:r>
+        <w:rPr/>
+        <w:t xml:space="preserve"> It checks correctness, security, readability, tests and performance, explains why, separates blockers from nits, and happens quickly.</w:t>
+      </w:r>
+    </w:p>
+    <w:p>
+      <w:r>
+        <w:rPr/>
+      </w:r>
+      <w:r>
+        <w:rPr>
+          <w:b/>
+        </w:rPr>
+        <w:t>Explanation:</w:t>
+      </w:r>
+      <w:r>
+        <w:rPr/>
+        <w:t xml:space="preserve"> Reviews are for quality and for teaching, so tone and speed matter as much as findings.</w:t>
+      </w:r>
+    </w:p>
+    <w:p>
+      <w:r>
+        <w:rPr/>
+      </w:r>
+      <w:r>
+        <w:rPr>
+          <w:b/>
+        </w:rPr>
+        <w:t>Example:</w:t>
+      </w:r>
+      <w:r>
+        <w:rPr/>
+        <w:t xml:space="preserve"> "Blocking: this endpoint doesn't check the tenant ID. Nit: consider renaming </w:t>
+      </w:r>
+      <w:r>
+        <w:rPr>
+          <w:rFonts w:ascii="Courier New" w:hAnsi="Courier New"/>
+          <w:color w:val="B42318"/>
+          <w:sz w:val="20"/>
+        </w:rPr>
+        <w:t>data</w:t>
+      </w:r>
+      <w:r>
+        <w:rPr/>
+        <w:t xml:space="preserve"> to </w:t>
+      </w:r>
+      <w:r>
+        <w:rPr>
+          <w:rFonts w:ascii="Courier New" w:hAnsi="Courier New"/>
+          <w:color w:val="B42318"/>
+          <w:sz w:val="20"/>
+        </w:rPr>
+        <w:t>scorecard</w:t>
+      </w:r>
+      <w:r>
+        <w:rPr/>
+        <w:t>. Nice: the test for the empty state."</w:t>
+      </w:r>
+    </w:p>
+    <w:p>
+      <w:r>
+        <w:rPr/>
+      </w:r>
+      <w:r>
+        <w:rPr>
+          <w:b/>
+        </w:rPr>
+        <w:t>Say it like this:</w:t>
       </w:r>
       <w:r>
         <w:rPr/>
@@ -4088,7 +5937,52 @@
         <w:rPr>
           <w:b/>
         </w:rPr>
-        <w:t>Sample answer:</w:t>
+        <w:t>Short answer:</w:t>
+      </w:r>
+      <w:r>
+        <w:rPr/>
+        <w:t xml:space="preserve"> Assign roles, mitigate before investigating, communicate regularly, and run a blameless postmortem with tracked actions.</w:t>
+      </w:r>
+    </w:p>
+    <w:p>
+      <w:r>
+        <w:rPr/>
+      </w:r>
+      <w:r>
+        <w:rPr>
+          <w:b/>
+        </w:rPr>
+        <w:t>Explanation:</w:t>
+      </w:r>
+      <w:r>
+        <w:rPr/>
+        <w:t xml:space="preserve"> Structure reduces chaos; postmortem actions that never get done mean the incident will happen again.</w:t>
+      </w:r>
+    </w:p>
+    <w:p>
+      <w:r>
+        <w:rPr/>
+      </w:r>
+      <w:r>
+        <w:rPr>
+          <w:b/>
+        </w:rPr>
+        <w:t>Example:</w:t>
+      </w:r>
+      <w:r>
+        <w:rPr/>
+        <w:t xml:space="preserve"> Incident lead, communications person and investigators, with 15-minute status updates.</w:t>
+      </w:r>
+    </w:p>
+    <w:p>
+      <w:r>
+        <w:rPr/>
+      </w:r>
+      <w:r>
+        <w:rPr>
+          <w:b/>
+        </w:rPr>
+        <w:t>Say it like this:</w:t>
       </w:r>
       <w:r>
         <w:rPr/>
@@ -4136,7 +6030,52 @@
         <w:rPr>
           <w:b/>
         </w:rPr>
-        <w:t>Sample answer:</w:t>
+        <w:t>Short answer:</w:t>
+      </w:r>
+      <w:r>
+        <w:rPr/>
+        <w:t xml:space="preserve"> Predictable delivery, early risk communication, business framing and concise written updates.</w:t>
+      </w:r>
+    </w:p>
+    <w:p>
+      <w:r>
+        <w:rPr/>
+      </w:r>
+      <w:r>
+        <w:rPr>
+          <w:b/>
+        </w:rPr>
+        <w:t>Explanation:</w:t>
+      </w:r>
+      <w:r>
+        <w:rPr/>
+        <w:t xml:space="preserve"> Leaders trust people whose updates are short, honest and framed in cost, risk and speed.</w:t>
+      </w:r>
+    </w:p>
+    <w:p>
+      <w:r>
+        <w:rPr/>
+      </w:r>
+      <w:r>
+        <w:rPr>
+          <w:b/>
+        </w:rPr>
+        <w:t>Example:</w:t>
+      </w:r>
+      <w:r>
+        <w:rPr/>
+        <w:t xml:space="preserve"> The self-hosting proposal led with cost and risk, not technology.</w:t>
+      </w:r>
+    </w:p>
+    <w:p>
+      <w:r>
+        <w:rPr/>
+      </w:r>
+      <w:r>
+        <w:rPr>
+          <w:b/>
+        </w:rPr>
+        <w:t>Say it like this:</w:t>
       </w:r>
       <w:r>
         <w:rPr/>
@@ -4185,7 +6124,52 @@
         <w:rPr>
           <w:b/>
         </w:rPr>
-        <w:t>Sample answer:</w:t>
+        <w:t>Short answer:</w:t>
+      </w:r>
+      <w:r>
+        <w:rPr/>
+        <w:t xml:space="preserve"> Total cost of ownership, differentiation, time to market, compliance, vendor risk and an exit strategy.</w:t>
+      </w:r>
+    </w:p>
+    <w:p>
+      <w:r>
+        <w:rPr/>
+      </w:r>
+      <w:r>
+        <w:rPr>
+          <w:b/>
+        </w:rPr>
+        <w:t>Explanation:</w:t>
+      </w:r>
+      <w:r>
+        <w:rPr/>
+        <w:t xml:space="preserve"> The hidden cost of building is operating it. The right answer can change as you scale.</w:t>
+      </w:r>
+    </w:p>
+    <w:p>
+      <w:r>
+        <w:rPr/>
+      </w:r>
+      <w:r>
+        <w:rPr>
+          <w:b/>
+        </w:rPr>
+        <w:t>Example:</w:t>
+      </w:r>
+      <w:r>
+        <w:rPr/>
+        <w:t xml:space="preserve"> Managed video early on; a self-hosting path once the cost model changed at scale.</w:t>
+      </w:r>
+    </w:p>
+    <w:p>
+      <w:r>
+        <w:rPr/>
+      </w:r>
+      <w:r>
+        <w:rPr>
+          <w:b/>
+        </w:rPr>
+        <w:t>Say it like this:</w:t>
       </w:r>
       <w:r>
         <w:rPr/>
@@ -4233,7 +6217,52 @@
         <w:rPr>
           <w:b/>
         </w:rPr>
-        <w:t>Sample answer:</w:t>
+        <w:t>Short answer:</w:t>
+      </w:r>
+      <w:r>
+        <w:rPr/>
+        <w:t xml:space="preserve"> Predictability, production quality, user outcomes, developer experience, and people's growth.</w:t>
+      </w:r>
+    </w:p>
+    <w:p>
+      <w:r>
+        <w:rPr/>
+      </w:r>
+      <w:r>
+        <w:rPr>
+          <w:b/>
+        </w:rPr>
+        <w:t>Explanation:</w:t>
+      </w:r>
+      <w:r>
+        <w:rPr/>
+        <w:t xml:space="preserve"> A balanced set prevents optimising one metric at the expense of others.</w:t>
+      </w:r>
+    </w:p>
+    <w:p>
+      <w:r>
+        <w:rPr/>
+      </w:r>
+      <w:r>
+        <w:rPr>
+          <w:b/>
+        </w:rPr>
+        <w:t>Example:</w:t>
+      </w:r>
+      <w:r>
+        <w:rPr/>
+        <w:t xml:space="preserve"> Escaped bugs per release, PR cycle time, a user metric like QA review time, and promotions or new responsibilities.</w:t>
+      </w:r>
+    </w:p>
+    <w:p>
+      <w:r>
+        <w:rPr/>
+      </w:r>
+      <w:r>
+        <w:rPr>
+          <w:b/>
+        </w:rPr>
+        <w:t>Say it like this:</w:t>
       </w:r>
       <w:r>
         <w:rPr/>

</xml_diff>